<commit_message>
Break out $1,485 revenue transfer memo by customer
Replace the monthly summary table with an itemized, per-customer
table (date, invoice #, amount, subtotal per client) for Andy Studer
Therapy, Gratitude and Growth Counseling, and Guidance Through Grief
Counseling.

Co-Authored-By: Claude Sonnet 5 <noreply@anthropic.com>
Claude-Session: https://claude.ai/code/session_01EWHJ4JSrXozykE2fwAhg1g
</commit_message>
<xml_diff>
--- a/Practice Budget Expenses Revenue Conversion/Intercompany Memo - Revenue Transfer $1485.docx
+++ b/Practice Budget Expenses Revenue Conversion/Intercompany Memo - Revenue Transfer $1485.docx
@@ -31,7 +31,7 @@
           <w:sz w:val="24"/>
           <w:szCs w:val="24"/>
         </w:rPr>
-        <w:t xml:space="preserve">Revenue Remittance</w:t>
+        <w:t xml:space="preserve">Revenue Remittance — by Customer</w:t>
       </w:r>
     </w:p>
     <w:p>
@@ -218,7 +218,7 @@
           <w:sz w:val="21"/>
           <w:szCs w:val="21"/>
         </w:rPr>
-        <w:t xml:space="preserve">GroupRB collects the $99/month “SEO &amp; Web Services” membership revenue owed to Parts of Practice through GroupRB's QuickBooks Payments merchant account. This memo documents the remittance of that collected revenue — 15 invoices across 3 clients, January through September 2026 — from GroupRB's SRP account to Parts of Practice's own Bluevine checking account.</w:t>
+        <w:t xml:space="preserve">GroupRB collects the $99/month “SEO &amp; Web Services” membership revenue owed to Parts of Practice through GroupRB's QuickBooks Payments merchant account. This memo documents the remittance of that collected revenue, itemized by client, from GroupRB's SRP account to Parts of Practice's own Bluevine checking account.</w:t>
       </w:r>
     </w:p>
     <w:p>
@@ -235,12 +235,12 @@
           <w:sz w:val="24"/>
           <w:szCs w:val="24"/>
         </w:rPr>
-        <w:t xml:space="preserve">Detail</w:t>
+        <w:t xml:space="preserve">Detail by Customer</w:t>
       </w:r>
     </w:p>
     <w:tbl>
       <w:tblPr>
-        <w:tblW w:type="dxa" w:w="7200"/>
+        <w:tblW w:type="dxa" w:w="8200"/>
         <w:tblBorders>
           <w:top w:val="single" w:color="D1D5DB" w:sz="2"/>
           <w:left w:val="single" w:color="D1D5DB" w:sz="2"/>
@@ -251,18 +251,20 @@
         </w:tblBorders>
       </w:tblPr>
       <w:tblGrid>
-        <w:gridCol w:w="5400"/>
-        <w:gridCol w:w="1800"/>
+        <w:gridCol w:w="2600"/>
+        <w:gridCol w:w="2600"/>
+        <w:gridCol w:w="3000"/>
       </w:tblGrid>
       <w:tr>
         <w:tc>
           <w:tcPr>
-            <w:tcW w:type="dxa" w:w="5400"/>
-            <w:shd w:fill="1F2937" w:val="clear"/>
-            <w:tcMar>
-              <w:top w:type="dxa" w:w="80"/>
-              <w:left w:type="dxa" w:w="120"/>
-              <w:bottom w:type="dxa" w:w="80"/>
+            <w:tcW w:type="dxa" w:w="8200"/>
+            <w:gridSpan w:val="3"/>
+            <w:shd w:fill="E5E7EB" w:val="clear"/>
+            <w:tcMar>
+              <w:top w:type="dxa" w:w="70"/>
+              <w:left w:type="dxa" w:w="120"/>
+              <w:bottom w:type="dxa" w:w="70"/>
               <w:right w:type="dxa" w:w="120"/>
             </w:tcMar>
           </w:tcPr>
@@ -275,39 +277,104 @@
                 <w:rFonts w:ascii="Arial" w:cs="Arial" w:eastAsia="Arial" w:hAnsi="Arial"/>
                 <w:b/>
                 <w:bCs/>
-                <w:color w:val="FFFFFF"/>
-                <w:sz w:val="20"/>
-                <w:szCs w:val="20"/>
-              </w:rPr>
-              <w:t xml:space="preserve">Month</w:t>
-            </w:r>
-          </w:p>
-        </w:tc>
-        <w:tc>
-          <w:tcPr>
-            <w:tcW w:type="dxa" w:w="1800"/>
+                <w:i w:val="false"/>
+                <w:iCs w:val="false"/>
+                <w:sz w:val="19"/>
+                <w:szCs w:val="19"/>
+              </w:rPr>
+              <w:t xml:space="preserve">Andy Studer Therapy</w:t>
+            </w:r>
+          </w:p>
+        </w:tc>
+      </w:tr>
+      <w:tr>
+        <w:tc>
+          <w:tcPr>
+            <w:tcW w:type="dxa" w:w="2600"/>
             <w:shd w:fill="1F2937" w:val="clear"/>
             <w:tcMar>
-              <w:top w:type="dxa" w:w="80"/>
-              <w:left w:type="dxa" w:w="120"/>
-              <w:bottom w:type="dxa" w:w="80"/>
-              <w:right w:type="dxa" w:w="120"/>
-            </w:tcMar>
-          </w:tcPr>
-          <w:p>
-            <w:pPr>
-              <w:jc w:val="right"/>
+              <w:top w:type="dxa" w:w="70"/>
+              <w:left w:type="dxa" w:w="120"/>
+              <w:bottom w:type="dxa" w:w="70"/>
+              <w:right w:type="dxa" w:w="120"/>
+            </w:tcMar>
+          </w:tcPr>
+          <w:p>
+            <w:pPr>
+              <w:jc w:val="left"/>
             </w:pPr>
             <w:r>
               <w:rPr>
                 <w:rFonts w:ascii="Arial" w:cs="Arial" w:eastAsia="Arial" w:hAnsi="Arial"/>
                 <w:b/>
                 <w:bCs/>
+                <w:i w:val="false"/>
+                <w:iCs w:val="false"/>
                 <w:color w:val="FFFFFF"/>
-                <w:sz w:val="20"/>
-                <w:szCs w:val="20"/>
-              </w:rPr>
-              <w:t xml:space="preserve">SEO &amp; Web Services Revenue</w:t>
+                <w:sz w:val="19"/>
+                <w:szCs w:val="19"/>
+              </w:rPr>
+              <w:t xml:space="preserve">Date</w:t>
+            </w:r>
+          </w:p>
+        </w:tc>
+        <w:tc>
+          <w:tcPr>
+            <w:tcW w:type="dxa" w:w="2600"/>
+            <w:shd w:fill="1F2937" w:val="clear"/>
+            <w:tcMar>
+              <w:top w:type="dxa" w:w="70"/>
+              <w:left w:type="dxa" w:w="120"/>
+              <w:bottom w:type="dxa" w:w="70"/>
+              <w:right w:type="dxa" w:w="120"/>
+            </w:tcMar>
+          </w:tcPr>
+          <w:p>
+            <w:pPr>
+              <w:jc w:val="left"/>
+            </w:pPr>
+            <w:r>
+              <w:rPr>
+                <w:rFonts w:ascii="Arial" w:cs="Arial" w:eastAsia="Arial" w:hAnsi="Arial"/>
+                <w:b/>
+                <w:bCs/>
+                <w:i w:val="false"/>
+                <w:iCs w:val="false"/>
+                <w:color w:val="FFFFFF"/>
+                <w:sz w:val="19"/>
+                <w:szCs w:val="19"/>
+              </w:rPr>
+              <w:t xml:space="preserve">Invoice #</w:t>
+            </w:r>
+          </w:p>
+        </w:tc>
+        <w:tc>
+          <w:tcPr>
+            <w:tcW w:type="dxa" w:w="3000"/>
+            <w:shd w:fill="1F2937" w:val="clear"/>
+            <w:tcMar>
+              <w:top w:type="dxa" w:w="70"/>
+              <w:left w:type="dxa" w:w="120"/>
+              <w:bottom w:type="dxa" w:w="70"/>
+              <w:right w:type="dxa" w:w="120"/>
+            </w:tcMar>
+          </w:tcPr>
+          <w:p>
+            <w:pPr>
+              <w:jc w:val="right"/>
+            </w:pPr>
+            <w:r>
+              <w:rPr>
+                <w:rFonts w:ascii="Arial" w:cs="Arial" w:eastAsia="Arial" w:hAnsi="Arial"/>
+                <w:b/>
+                <w:bCs/>
+                <w:i w:val="false"/>
+                <w:iCs w:val="false"/>
+                <w:color w:val="FFFFFF"/>
+                <w:sz w:val="19"/>
+                <w:szCs w:val="19"/>
+              </w:rPr>
+              <w:t xml:space="preserve">Amount</w:t>
             </w:r>
           </w:p>
         </w:tc>
@@ -315,37 +382,67 @@
       <w:tr>
         <w:tc>
           <w:tcPr>
-            <w:tcW w:type="dxa" w:w="5400"/>
-            <w:tcMar>
-              <w:top w:type="dxa" w:w="80"/>
-              <w:left w:type="dxa" w:w="120"/>
-              <w:bottom w:type="dxa" w:w="80"/>
-              <w:right w:type="dxa" w:w="120"/>
-            </w:tcMar>
-          </w:tcPr>
-          <w:p>
-            <w:pPr>
-              <w:jc w:val="left"/>
-            </w:pPr>
-            <w:r>
-              <w:rPr>
-                <w:rFonts w:ascii="Arial" w:cs="Arial" w:eastAsia="Arial" w:hAnsi="Arial"/>
-                <w:b w:val="false"/>
-                <w:bCs w:val="false"/>
-                <w:sz w:val="20"/>
-                <w:szCs w:val="20"/>
-              </w:rPr>
-              <w:t xml:space="preserve">Jan-26</w:t>
-            </w:r>
-          </w:p>
-        </w:tc>
-        <w:tc>
-          <w:tcPr>
-            <w:tcW w:type="dxa" w:w="1800"/>
-            <w:tcMar>
-              <w:top w:type="dxa" w:w="80"/>
-              <w:left w:type="dxa" w:w="120"/>
-              <w:bottom w:type="dxa" w:w="80"/>
+            <w:tcW w:type="dxa" w:w="2600"/>
+            <w:tcMar>
+              <w:top w:type="dxa" w:w="70"/>
+              <w:left w:type="dxa" w:w="120"/>
+              <w:bottom w:type="dxa" w:w="70"/>
+              <w:right w:type="dxa" w:w="120"/>
+            </w:tcMar>
+          </w:tcPr>
+          <w:p>
+            <w:pPr>
+              <w:jc w:val="left"/>
+            </w:pPr>
+            <w:r>
+              <w:rPr>
+                <w:rFonts w:ascii="Arial" w:cs="Arial" w:eastAsia="Arial" w:hAnsi="Arial"/>
+                <w:b w:val="false"/>
+                <w:bCs w:val="false"/>
+                <w:i w:val="false"/>
+                <w:iCs w:val="false"/>
+                <w:sz w:val="19"/>
+                <w:szCs w:val="19"/>
+              </w:rPr>
+              <w:t xml:space="preserve">1/31/26</w:t>
+            </w:r>
+          </w:p>
+        </w:tc>
+        <w:tc>
+          <w:tcPr>
+            <w:tcW w:type="dxa" w:w="2600"/>
+            <w:tcMar>
+              <w:top w:type="dxa" w:w="70"/>
+              <w:left w:type="dxa" w:w="120"/>
+              <w:bottom w:type="dxa" w:w="70"/>
+              <w:right w:type="dxa" w:w="120"/>
+            </w:tcMar>
+          </w:tcPr>
+          <w:p>
+            <w:pPr>
+              <w:jc w:val="left"/>
+            </w:pPr>
+            <w:r>
+              <w:rPr>
+                <w:rFonts w:ascii="Arial" w:cs="Arial" w:eastAsia="Arial" w:hAnsi="Arial"/>
+                <w:b w:val="false"/>
+                <w:bCs w:val="false"/>
+                <w:i w:val="false"/>
+                <w:iCs w:val="false"/>
+                <w:sz w:val="19"/>
+                <w:szCs w:val="19"/>
+              </w:rPr>
+              <w:t xml:space="preserve">22183</w:t>
+            </w:r>
+          </w:p>
+        </w:tc>
+        <w:tc>
+          <w:tcPr>
+            <w:tcW w:type="dxa" w:w="3000"/>
+            <w:tcMar>
+              <w:top w:type="dxa" w:w="70"/>
+              <w:left w:type="dxa" w:w="120"/>
+              <w:bottom w:type="dxa" w:w="70"/>
               <w:right w:type="dxa" w:w="120"/>
             </w:tcMar>
           </w:tcPr>
@@ -358,10 +455,12 @@
                 <w:rFonts w:ascii="Arial" w:cs="Arial" w:eastAsia="Arial" w:hAnsi="Arial"/>
                 <w:b w:val="false"/>
                 <w:bCs w:val="false"/>
-                <w:sz w:val="20"/>
-                <w:szCs w:val="20"/>
-              </w:rPr>
-              <w:t xml:space="preserve">$198.00</w:t>
+                <w:i w:val="false"/>
+                <w:iCs w:val="false"/>
+                <w:sz w:val="19"/>
+                <w:szCs w:val="19"/>
+              </w:rPr>
+              <w:t xml:space="preserve">$99.00</w:t>
             </w:r>
           </w:p>
         </w:tc>
@@ -369,37 +468,67 @@
       <w:tr>
         <w:tc>
           <w:tcPr>
-            <w:tcW w:type="dxa" w:w="5400"/>
-            <w:tcMar>
-              <w:top w:type="dxa" w:w="80"/>
-              <w:left w:type="dxa" w:w="120"/>
-              <w:bottom w:type="dxa" w:w="80"/>
-              <w:right w:type="dxa" w:w="120"/>
-            </w:tcMar>
-          </w:tcPr>
-          <w:p>
-            <w:pPr>
-              <w:jc w:val="left"/>
-            </w:pPr>
-            <w:r>
-              <w:rPr>
-                <w:rFonts w:ascii="Arial" w:cs="Arial" w:eastAsia="Arial" w:hAnsi="Arial"/>
-                <w:b w:val="false"/>
-                <w:bCs w:val="false"/>
-                <w:sz w:val="20"/>
-                <w:szCs w:val="20"/>
-              </w:rPr>
-              <w:t xml:space="preserve">Feb-26</w:t>
-            </w:r>
-          </w:p>
-        </w:tc>
-        <w:tc>
-          <w:tcPr>
-            <w:tcW w:type="dxa" w:w="1800"/>
-            <w:tcMar>
-              <w:top w:type="dxa" w:w="80"/>
-              <w:left w:type="dxa" w:w="120"/>
-              <w:bottom w:type="dxa" w:w="80"/>
+            <w:tcW w:type="dxa" w:w="2600"/>
+            <w:tcMar>
+              <w:top w:type="dxa" w:w="70"/>
+              <w:left w:type="dxa" w:w="120"/>
+              <w:bottom w:type="dxa" w:w="70"/>
+              <w:right w:type="dxa" w:w="120"/>
+            </w:tcMar>
+          </w:tcPr>
+          <w:p>
+            <w:pPr>
+              <w:jc w:val="left"/>
+            </w:pPr>
+            <w:r>
+              <w:rPr>
+                <w:rFonts w:ascii="Arial" w:cs="Arial" w:eastAsia="Arial" w:hAnsi="Arial"/>
+                <w:b w:val="false"/>
+                <w:bCs w:val="false"/>
+                <w:i w:val="false"/>
+                <w:iCs w:val="false"/>
+                <w:sz w:val="19"/>
+                <w:szCs w:val="19"/>
+              </w:rPr>
+              <w:t xml:space="preserve">3/2/26</w:t>
+            </w:r>
+          </w:p>
+        </w:tc>
+        <w:tc>
+          <w:tcPr>
+            <w:tcW w:type="dxa" w:w="2600"/>
+            <w:tcMar>
+              <w:top w:type="dxa" w:w="70"/>
+              <w:left w:type="dxa" w:w="120"/>
+              <w:bottom w:type="dxa" w:w="70"/>
+              <w:right w:type="dxa" w:w="120"/>
+            </w:tcMar>
+          </w:tcPr>
+          <w:p>
+            <w:pPr>
+              <w:jc w:val="left"/>
+            </w:pPr>
+            <w:r>
+              <w:rPr>
+                <w:rFonts w:ascii="Arial" w:cs="Arial" w:eastAsia="Arial" w:hAnsi="Arial"/>
+                <w:b w:val="false"/>
+                <w:bCs w:val="false"/>
+                <w:i w:val="false"/>
+                <w:iCs w:val="false"/>
+                <w:sz w:val="19"/>
+                <w:szCs w:val="19"/>
+              </w:rPr>
+              <w:t xml:space="preserve">22188</w:t>
+            </w:r>
+          </w:p>
+        </w:tc>
+        <w:tc>
+          <w:tcPr>
+            <w:tcW w:type="dxa" w:w="3000"/>
+            <w:tcMar>
+              <w:top w:type="dxa" w:w="70"/>
+              <w:left w:type="dxa" w:w="120"/>
+              <w:bottom w:type="dxa" w:w="70"/>
               <w:right w:type="dxa" w:w="120"/>
             </w:tcMar>
           </w:tcPr>
@@ -412,10 +541,12 @@
                 <w:rFonts w:ascii="Arial" w:cs="Arial" w:eastAsia="Arial" w:hAnsi="Arial"/>
                 <w:b w:val="false"/>
                 <w:bCs w:val="false"/>
-                <w:sz w:val="20"/>
-                <w:szCs w:val="20"/>
-              </w:rPr>
-              <w:t xml:space="preserve">$0.00</w:t>
+                <w:i w:val="false"/>
+                <w:iCs w:val="false"/>
+                <w:sz w:val="19"/>
+                <w:szCs w:val="19"/>
+              </w:rPr>
+              <w:t xml:space="preserve">$99.00</w:t>
             </w:r>
           </w:p>
         </w:tc>
@@ -423,37 +554,67 @@
       <w:tr>
         <w:tc>
           <w:tcPr>
-            <w:tcW w:type="dxa" w:w="5400"/>
-            <w:tcMar>
-              <w:top w:type="dxa" w:w="80"/>
-              <w:left w:type="dxa" w:w="120"/>
-              <w:bottom w:type="dxa" w:w="80"/>
-              <w:right w:type="dxa" w:w="120"/>
-            </w:tcMar>
-          </w:tcPr>
-          <w:p>
-            <w:pPr>
-              <w:jc w:val="left"/>
-            </w:pPr>
-            <w:r>
-              <w:rPr>
-                <w:rFonts w:ascii="Arial" w:cs="Arial" w:eastAsia="Arial" w:hAnsi="Arial"/>
-                <w:b w:val="false"/>
-                <w:bCs w:val="false"/>
-                <w:sz w:val="20"/>
-                <w:szCs w:val="20"/>
-              </w:rPr>
-              <w:t xml:space="preserve">Mar-26</w:t>
-            </w:r>
-          </w:p>
-        </w:tc>
-        <w:tc>
-          <w:tcPr>
-            <w:tcW w:type="dxa" w:w="1800"/>
-            <w:tcMar>
-              <w:top w:type="dxa" w:w="80"/>
-              <w:left w:type="dxa" w:w="120"/>
-              <w:bottom w:type="dxa" w:w="80"/>
+            <w:tcW w:type="dxa" w:w="2600"/>
+            <w:tcMar>
+              <w:top w:type="dxa" w:w="70"/>
+              <w:left w:type="dxa" w:w="120"/>
+              <w:bottom w:type="dxa" w:w="70"/>
+              <w:right w:type="dxa" w:w="120"/>
+            </w:tcMar>
+          </w:tcPr>
+          <w:p>
+            <w:pPr>
+              <w:jc w:val="left"/>
+            </w:pPr>
+            <w:r>
+              <w:rPr>
+                <w:rFonts w:ascii="Arial" w:cs="Arial" w:eastAsia="Arial" w:hAnsi="Arial"/>
+                <w:b w:val="false"/>
+                <w:bCs w:val="false"/>
+                <w:i w:val="false"/>
+                <w:iCs w:val="false"/>
+                <w:sz w:val="19"/>
+                <w:szCs w:val="19"/>
+              </w:rPr>
+              <w:t xml:space="preserve">3/31/26</w:t>
+            </w:r>
+          </w:p>
+        </w:tc>
+        <w:tc>
+          <w:tcPr>
+            <w:tcW w:type="dxa" w:w="2600"/>
+            <w:tcMar>
+              <w:top w:type="dxa" w:w="70"/>
+              <w:left w:type="dxa" w:w="120"/>
+              <w:bottom w:type="dxa" w:w="70"/>
+              <w:right w:type="dxa" w:w="120"/>
+            </w:tcMar>
+          </w:tcPr>
+          <w:p>
+            <w:pPr>
+              <w:jc w:val="left"/>
+            </w:pPr>
+            <w:r>
+              <w:rPr>
+                <w:rFonts w:ascii="Arial" w:cs="Arial" w:eastAsia="Arial" w:hAnsi="Arial"/>
+                <w:b w:val="false"/>
+                <w:bCs w:val="false"/>
+                <w:i w:val="false"/>
+                <w:iCs w:val="false"/>
+                <w:sz w:val="19"/>
+                <w:szCs w:val="19"/>
+              </w:rPr>
+              <w:t xml:space="preserve">22192</w:t>
+            </w:r>
+          </w:p>
+        </w:tc>
+        <w:tc>
+          <w:tcPr>
+            <w:tcW w:type="dxa" w:w="3000"/>
+            <w:tcMar>
+              <w:top w:type="dxa" w:w="70"/>
+              <w:left w:type="dxa" w:w="120"/>
+              <w:bottom w:type="dxa" w:w="70"/>
               <w:right w:type="dxa" w:w="120"/>
             </w:tcMar>
           </w:tcPr>
@@ -466,10 +627,12 @@
                 <w:rFonts w:ascii="Arial" w:cs="Arial" w:eastAsia="Arial" w:hAnsi="Arial"/>
                 <w:b w:val="false"/>
                 <w:bCs w:val="false"/>
-                <w:sz w:val="20"/>
-                <w:szCs w:val="20"/>
-              </w:rPr>
-              <w:t xml:space="preserve">$396.00</w:t>
+                <w:i w:val="false"/>
+                <w:iCs w:val="false"/>
+                <w:sz w:val="19"/>
+                <w:szCs w:val="19"/>
+              </w:rPr>
+              <w:t xml:space="preserve">$99.00</w:t>
             </w:r>
           </w:p>
         </w:tc>
@@ -477,37 +640,67 @@
       <w:tr>
         <w:tc>
           <w:tcPr>
-            <w:tcW w:type="dxa" w:w="5400"/>
-            <w:tcMar>
-              <w:top w:type="dxa" w:w="80"/>
-              <w:left w:type="dxa" w:w="120"/>
-              <w:bottom w:type="dxa" w:w="80"/>
-              <w:right w:type="dxa" w:w="120"/>
-            </w:tcMar>
-          </w:tcPr>
-          <w:p>
-            <w:pPr>
-              <w:jc w:val="left"/>
-            </w:pPr>
-            <w:r>
-              <w:rPr>
-                <w:rFonts w:ascii="Arial" w:cs="Arial" w:eastAsia="Arial" w:hAnsi="Arial"/>
-                <w:b w:val="false"/>
-                <w:bCs w:val="false"/>
-                <w:sz w:val="20"/>
-                <w:szCs w:val="20"/>
-              </w:rPr>
-              <w:t xml:space="preserve">Apr-26</w:t>
-            </w:r>
-          </w:p>
-        </w:tc>
-        <w:tc>
-          <w:tcPr>
-            <w:tcW w:type="dxa" w:w="1800"/>
-            <w:tcMar>
-              <w:top w:type="dxa" w:w="80"/>
-              <w:left w:type="dxa" w:w="120"/>
-              <w:bottom w:type="dxa" w:w="80"/>
+            <w:tcW w:type="dxa" w:w="2600"/>
+            <w:tcMar>
+              <w:top w:type="dxa" w:w="70"/>
+              <w:left w:type="dxa" w:w="120"/>
+              <w:bottom w:type="dxa" w:w="70"/>
+              <w:right w:type="dxa" w:w="120"/>
+            </w:tcMar>
+          </w:tcPr>
+          <w:p>
+            <w:pPr>
+              <w:jc w:val="left"/>
+            </w:pPr>
+            <w:r>
+              <w:rPr>
+                <w:rFonts w:ascii="Arial" w:cs="Arial" w:eastAsia="Arial" w:hAnsi="Arial"/>
+                <w:b w:val="false"/>
+                <w:bCs w:val="false"/>
+                <w:i w:val="false"/>
+                <w:iCs w:val="false"/>
+                <w:sz w:val="19"/>
+                <w:szCs w:val="19"/>
+              </w:rPr>
+              <w:t xml:space="preserve">5/4/26</w:t>
+            </w:r>
+          </w:p>
+        </w:tc>
+        <w:tc>
+          <w:tcPr>
+            <w:tcW w:type="dxa" w:w="2600"/>
+            <w:tcMar>
+              <w:top w:type="dxa" w:w="70"/>
+              <w:left w:type="dxa" w:w="120"/>
+              <w:bottom w:type="dxa" w:w="70"/>
+              <w:right w:type="dxa" w:w="120"/>
+            </w:tcMar>
+          </w:tcPr>
+          <w:p>
+            <w:pPr>
+              <w:jc w:val="left"/>
+            </w:pPr>
+            <w:r>
+              <w:rPr>
+                <w:rFonts w:ascii="Arial" w:cs="Arial" w:eastAsia="Arial" w:hAnsi="Arial"/>
+                <w:b w:val="false"/>
+                <w:bCs w:val="false"/>
+                <w:i w:val="false"/>
+                <w:iCs w:val="false"/>
+                <w:sz w:val="19"/>
+                <w:szCs w:val="19"/>
+              </w:rPr>
+              <w:t xml:space="preserve">22197</w:t>
+            </w:r>
+          </w:p>
+        </w:tc>
+        <w:tc>
+          <w:tcPr>
+            <w:tcW w:type="dxa" w:w="3000"/>
+            <w:tcMar>
+              <w:top w:type="dxa" w:w="70"/>
+              <w:left w:type="dxa" w:w="120"/>
+              <w:bottom w:type="dxa" w:w="70"/>
               <w:right w:type="dxa" w:w="120"/>
             </w:tcMar>
           </w:tcPr>
@@ -520,10 +713,12 @@
                 <w:rFonts w:ascii="Arial" w:cs="Arial" w:eastAsia="Arial" w:hAnsi="Arial"/>
                 <w:b w:val="false"/>
                 <w:bCs w:val="false"/>
-                <w:sz w:val="20"/>
-                <w:szCs w:val="20"/>
-              </w:rPr>
-              <w:t xml:space="preserve">$0.00</w:t>
+                <w:i w:val="false"/>
+                <w:iCs w:val="false"/>
+                <w:sz w:val="19"/>
+                <w:szCs w:val="19"/>
+              </w:rPr>
+              <w:t xml:space="preserve">$99.00</w:t>
             </w:r>
           </w:p>
         </w:tc>
@@ -531,37 +726,67 @@
       <w:tr>
         <w:tc>
           <w:tcPr>
-            <w:tcW w:type="dxa" w:w="5400"/>
-            <w:tcMar>
-              <w:top w:type="dxa" w:w="80"/>
-              <w:left w:type="dxa" w:w="120"/>
-              <w:bottom w:type="dxa" w:w="80"/>
-              <w:right w:type="dxa" w:w="120"/>
-            </w:tcMar>
-          </w:tcPr>
-          <w:p>
-            <w:pPr>
-              <w:jc w:val="left"/>
-            </w:pPr>
-            <w:r>
-              <w:rPr>
-                <w:rFonts w:ascii="Arial" w:cs="Arial" w:eastAsia="Arial" w:hAnsi="Arial"/>
-                <w:b w:val="false"/>
-                <w:bCs w:val="false"/>
-                <w:sz w:val="20"/>
-                <w:szCs w:val="20"/>
-              </w:rPr>
-              <w:t xml:space="preserve">May-26</w:t>
-            </w:r>
-          </w:p>
-        </w:tc>
-        <w:tc>
-          <w:tcPr>
-            <w:tcW w:type="dxa" w:w="1800"/>
-            <w:tcMar>
-              <w:top w:type="dxa" w:w="80"/>
-              <w:left w:type="dxa" w:w="120"/>
-              <w:bottom w:type="dxa" w:w="80"/>
+            <w:tcW w:type="dxa" w:w="2600"/>
+            <w:tcMar>
+              <w:top w:type="dxa" w:w="70"/>
+              <w:left w:type="dxa" w:w="120"/>
+              <w:bottom w:type="dxa" w:w="70"/>
+              <w:right w:type="dxa" w:w="120"/>
+            </w:tcMar>
+          </w:tcPr>
+          <w:p>
+            <w:pPr>
+              <w:jc w:val="left"/>
+            </w:pPr>
+            <w:r>
+              <w:rPr>
+                <w:rFonts w:ascii="Arial" w:cs="Arial" w:eastAsia="Arial" w:hAnsi="Arial"/>
+                <w:b w:val="false"/>
+                <w:bCs w:val="false"/>
+                <w:i w:val="false"/>
+                <w:iCs w:val="false"/>
+                <w:sz w:val="19"/>
+                <w:szCs w:val="19"/>
+              </w:rPr>
+              <w:t xml:space="preserve">6/8/26</w:t>
+            </w:r>
+          </w:p>
+        </w:tc>
+        <w:tc>
+          <w:tcPr>
+            <w:tcW w:type="dxa" w:w="2600"/>
+            <w:tcMar>
+              <w:top w:type="dxa" w:w="70"/>
+              <w:left w:type="dxa" w:w="120"/>
+              <w:bottom w:type="dxa" w:w="70"/>
+              <w:right w:type="dxa" w:w="120"/>
+            </w:tcMar>
+          </w:tcPr>
+          <w:p>
+            <w:pPr>
+              <w:jc w:val="left"/>
+            </w:pPr>
+            <w:r>
+              <w:rPr>
+                <w:rFonts w:ascii="Arial" w:cs="Arial" w:eastAsia="Arial" w:hAnsi="Arial"/>
+                <w:b w:val="false"/>
+                <w:bCs w:val="false"/>
+                <w:i w:val="false"/>
+                <w:iCs w:val="false"/>
+                <w:sz w:val="19"/>
+                <w:szCs w:val="19"/>
+              </w:rPr>
+              <w:t xml:space="preserve">22201</w:t>
+            </w:r>
+          </w:p>
+        </w:tc>
+        <w:tc>
+          <w:tcPr>
+            <w:tcW w:type="dxa" w:w="3000"/>
+            <w:tcMar>
+              <w:top w:type="dxa" w:w="70"/>
+              <w:left w:type="dxa" w:w="120"/>
+              <w:bottom w:type="dxa" w:w="70"/>
               <w:right w:type="dxa" w:w="120"/>
             </w:tcMar>
           </w:tcPr>
@@ -574,10 +799,12 @@
                 <w:rFonts w:ascii="Arial" w:cs="Arial" w:eastAsia="Arial" w:hAnsi="Arial"/>
                 <w:b w:val="false"/>
                 <w:bCs w:val="false"/>
-                <w:sz w:val="20"/>
-                <w:szCs w:val="20"/>
-              </w:rPr>
-              <w:t xml:space="preserve">$198.00</w:t>
+                <w:i w:val="false"/>
+                <w:iCs w:val="false"/>
+                <w:sz w:val="19"/>
+                <w:szCs w:val="19"/>
+              </w:rPr>
+              <w:t xml:space="preserve">$99.00</w:t>
             </w:r>
           </w:p>
         </w:tc>
@@ -585,37 +812,67 @@
       <w:tr>
         <w:tc>
           <w:tcPr>
-            <w:tcW w:type="dxa" w:w="5400"/>
-            <w:tcMar>
-              <w:top w:type="dxa" w:w="80"/>
-              <w:left w:type="dxa" w:w="120"/>
-              <w:bottom w:type="dxa" w:w="80"/>
-              <w:right w:type="dxa" w:w="120"/>
-            </w:tcMar>
-          </w:tcPr>
-          <w:p>
-            <w:pPr>
-              <w:jc w:val="left"/>
-            </w:pPr>
-            <w:r>
-              <w:rPr>
-                <w:rFonts w:ascii="Arial" w:cs="Arial" w:eastAsia="Arial" w:hAnsi="Arial"/>
-                <w:b w:val="false"/>
-                <w:bCs w:val="false"/>
-                <w:sz w:val="20"/>
-                <w:szCs w:val="20"/>
-              </w:rPr>
-              <w:t xml:space="preserve">Jun-26</w:t>
-            </w:r>
-          </w:p>
-        </w:tc>
-        <w:tc>
-          <w:tcPr>
-            <w:tcW w:type="dxa" w:w="1800"/>
-            <w:tcMar>
-              <w:top w:type="dxa" w:w="80"/>
-              <w:left w:type="dxa" w:w="120"/>
-              <w:bottom w:type="dxa" w:w="80"/>
+            <w:tcW w:type="dxa" w:w="2600"/>
+            <w:tcMar>
+              <w:top w:type="dxa" w:w="70"/>
+              <w:left w:type="dxa" w:w="120"/>
+              <w:bottom w:type="dxa" w:w="70"/>
+              <w:right w:type="dxa" w:w="120"/>
+            </w:tcMar>
+          </w:tcPr>
+          <w:p>
+            <w:pPr>
+              <w:jc w:val="left"/>
+            </w:pPr>
+            <w:r>
+              <w:rPr>
+                <w:rFonts w:ascii="Arial" w:cs="Arial" w:eastAsia="Arial" w:hAnsi="Arial"/>
+                <w:b w:val="false"/>
+                <w:bCs w:val="false"/>
+                <w:i w:val="false"/>
+                <w:iCs w:val="false"/>
+                <w:sz w:val="19"/>
+                <w:szCs w:val="19"/>
+              </w:rPr>
+              <w:t xml:space="preserve">7/1/26</w:t>
+            </w:r>
+          </w:p>
+        </w:tc>
+        <w:tc>
+          <w:tcPr>
+            <w:tcW w:type="dxa" w:w="2600"/>
+            <w:tcMar>
+              <w:top w:type="dxa" w:w="70"/>
+              <w:left w:type="dxa" w:w="120"/>
+              <w:bottom w:type="dxa" w:w="70"/>
+              <w:right w:type="dxa" w:w="120"/>
+            </w:tcMar>
+          </w:tcPr>
+          <w:p>
+            <w:pPr>
+              <w:jc w:val="left"/>
+            </w:pPr>
+            <w:r>
+              <w:rPr>
+                <w:rFonts w:ascii="Arial" w:cs="Arial" w:eastAsia="Arial" w:hAnsi="Arial"/>
+                <w:b w:val="false"/>
+                <w:bCs w:val="false"/>
+                <w:i w:val="false"/>
+                <w:iCs w:val="false"/>
+                <w:sz w:val="19"/>
+                <w:szCs w:val="19"/>
+              </w:rPr>
+              <w:t xml:space="preserve">22206</w:t>
+            </w:r>
+          </w:p>
+        </w:tc>
+        <w:tc>
+          <w:tcPr>
+            <w:tcW w:type="dxa" w:w="3000"/>
+            <w:tcMar>
+              <w:top w:type="dxa" w:w="70"/>
+              <w:left w:type="dxa" w:w="120"/>
+              <w:bottom w:type="dxa" w:w="70"/>
               <w:right w:type="dxa" w:w="120"/>
             </w:tcMar>
           </w:tcPr>
@@ -628,10 +885,12 @@
                 <w:rFonts w:ascii="Arial" w:cs="Arial" w:eastAsia="Arial" w:hAnsi="Arial"/>
                 <w:b w:val="false"/>
                 <w:bCs w:val="false"/>
-                <w:sz w:val="20"/>
-                <w:szCs w:val="20"/>
-              </w:rPr>
-              <w:t xml:space="preserve">$198.00</w:t>
+                <w:i w:val="false"/>
+                <w:iCs w:val="false"/>
+                <w:sz w:val="19"/>
+                <w:szCs w:val="19"/>
+              </w:rPr>
+              <w:t xml:space="preserve">$99.00</w:t>
             </w:r>
           </w:p>
         </w:tc>
@@ -639,37 +898,67 @@
       <w:tr>
         <w:tc>
           <w:tcPr>
-            <w:tcW w:type="dxa" w:w="5400"/>
-            <w:tcMar>
-              <w:top w:type="dxa" w:w="80"/>
-              <w:left w:type="dxa" w:w="120"/>
-              <w:bottom w:type="dxa" w:w="80"/>
-              <w:right w:type="dxa" w:w="120"/>
-            </w:tcMar>
-          </w:tcPr>
-          <w:p>
-            <w:pPr>
-              <w:jc w:val="left"/>
-            </w:pPr>
-            <w:r>
-              <w:rPr>
-                <w:rFonts w:ascii="Arial" w:cs="Arial" w:eastAsia="Arial" w:hAnsi="Arial"/>
-                <w:b w:val="false"/>
-                <w:bCs w:val="false"/>
-                <w:sz w:val="20"/>
-                <w:szCs w:val="20"/>
-              </w:rPr>
-              <w:t xml:space="preserve">Jul-26</w:t>
-            </w:r>
-          </w:p>
-        </w:tc>
-        <w:tc>
-          <w:tcPr>
-            <w:tcW w:type="dxa" w:w="1800"/>
-            <w:tcMar>
-              <w:top w:type="dxa" w:w="80"/>
-              <w:left w:type="dxa" w:w="120"/>
-              <w:bottom w:type="dxa" w:w="80"/>
+            <w:tcW w:type="dxa" w:w="2600"/>
+            <w:tcMar>
+              <w:top w:type="dxa" w:w="70"/>
+              <w:left w:type="dxa" w:w="120"/>
+              <w:bottom w:type="dxa" w:w="70"/>
+              <w:right w:type="dxa" w:w="120"/>
+            </w:tcMar>
+          </w:tcPr>
+          <w:p>
+            <w:pPr>
+              <w:jc w:val="left"/>
+            </w:pPr>
+            <w:r>
+              <w:rPr>
+                <w:rFonts w:ascii="Arial" w:cs="Arial" w:eastAsia="Arial" w:hAnsi="Arial"/>
+                <w:b w:val="false"/>
+                <w:bCs w:val="false"/>
+                <w:i w:val="false"/>
+                <w:iCs w:val="false"/>
+                <w:sz w:val="19"/>
+                <w:szCs w:val="19"/>
+              </w:rPr>
+              <w:t xml:space="preserve">8/5/26</w:t>
+            </w:r>
+          </w:p>
+        </w:tc>
+        <w:tc>
+          <w:tcPr>
+            <w:tcW w:type="dxa" w:w="2600"/>
+            <w:tcMar>
+              <w:top w:type="dxa" w:w="70"/>
+              <w:left w:type="dxa" w:w="120"/>
+              <w:bottom w:type="dxa" w:w="70"/>
+              <w:right w:type="dxa" w:w="120"/>
+            </w:tcMar>
+          </w:tcPr>
+          <w:p>
+            <w:pPr>
+              <w:jc w:val="left"/>
+            </w:pPr>
+            <w:r>
+              <w:rPr>
+                <w:rFonts w:ascii="Arial" w:cs="Arial" w:eastAsia="Arial" w:hAnsi="Arial"/>
+                <w:b w:val="false"/>
+                <w:bCs w:val="false"/>
+                <w:i w:val="false"/>
+                <w:iCs w:val="false"/>
+                <w:sz w:val="19"/>
+                <w:szCs w:val="19"/>
+              </w:rPr>
+              <w:t xml:space="preserve">22209</w:t>
+            </w:r>
+          </w:p>
+        </w:tc>
+        <w:tc>
+          <w:tcPr>
+            <w:tcW w:type="dxa" w:w="3000"/>
+            <w:tcMar>
+              <w:top w:type="dxa" w:w="70"/>
+              <w:left w:type="dxa" w:w="120"/>
+              <w:bottom w:type="dxa" w:w="70"/>
               <w:right w:type="dxa" w:w="120"/>
             </w:tcMar>
           </w:tcPr>
@@ -682,10 +971,12 @@
                 <w:rFonts w:ascii="Arial" w:cs="Arial" w:eastAsia="Arial" w:hAnsi="Arial"/>
                 <w:b w:val="false"/>
                 <w:bCs w:val="false"/>
-                <w:sz w:val="20"/>
-                <w:szCs w:val="20"/>
-              </w:rPr>
-              <w:t xml:space="preserve">$198.00</w:t>
+                <w:i w:val="false"/>
+                <w:iCs w:val="false"/>
+                <w:sz w:val="19"/>
+                <w:szCs w:val="19"/>
+              </w:rPr>
+              <w:t xml:space="preserve">$99.00</w:t>
             </w:r>
           </w:p>
         </w:tc>
@@ -693,37 +984,42 @@
       <w:tr>
         <w:tc>
           <w:tcPr>
-            <w:tcW w:type="dxa" w:w="5400"/>
-            <w:tcMar>
-              <w:top w:type="dxa" w:w="80"/>
-              <w:left w:type="dxa" w:w="120"/>
-              <w:bottom w:type="dxa" w:w="80"/>
-              <w:right w:type="dxa" w:w="120"/>
-            </w:tcMar>
-          </w:tcPr>
-          <w:p>
-            <w:pPr>
-              <w:jc w:val="left"/>
-            </w:pPr>
-            <w:r>
-              <w:rPr>
-                <w:rFonts w:ascii="Arial" w:cs="Arial" w:eastAsia="Arial" w:hAnsi="Arial"/>
-                <w:b w:val="false"/>
-                <w:bCs w:val="false"/>
-                <w:sz w:val="20"/>
-                <w:szCs w:val="20"/>
-              </w:rPr>
-              <w:t xml:space="preserve">Aug-26</w:t>
-            </w:r>
-          </w:p>
-        </w:tc>
-        <w:tc>
-          <w:tcPr>
-            <w:tcW w:type="dxa" w:w="1800"/>
-            <w:tcMar>
-              <w:top w:type="dxa" w:w="80"/>
-              <w:left w:type="dxa" w:w="120"/>
-              <w:bottom w:type="dxa" w:w="80"/>
+            <w:tcW w:type="dxa" w:w="5200"/>
+            <w:gridSpan w:val="2"/>
+            <w:shd w:fill="F3F4F6" w:val="clear"/>
+            <w:tcMar>
+              <w:top w:type="dxa" w:w="70"/>
+              <w:left w:type="dxa" w:w="120"/>
+              <w:bottom w:type="dxa" w:w="70"/>
+              <w:right w:type="dxa" w:w="120"/>
+            </w:tcMar>
+          </w:tcPr>
+          <w:p>
+            <w:pPr>
+              <w:jc w:val="left"/>
+            </w:pPr>
+            <w:r>
+              <w:rPr>
+                <w:rFonts w:ascii="Arial" w:cs="Arial" w:eastAsia="Arial" w:hAnsi="Arial"/>
+                <w:b/>
+                <w:bCs/>
+                <w:i w:val="false"/>
+                <w:iCs w:val="false"/>
+                <w:sz w:val="19"/>
+                <w:szCs w:val="19"/>
+              </w:rPr>
+              <w:t xml:space="preserve">Subtotal — 7 invoices</w:t>
+            </w:r>
+          </w:p>
+        </w:tc>
+        <w:tc>
+          <w:tcPr>
+            <w:tcW w:type="dxa" w:w="3000"/>
+            <w:shd w:fill="F3F4F6" w:val="clear"/>
+            <w:tcMar>
+              <w:top w:type="dxa" w:w="70"/>
+              <w:left w:type="dxa" w:w="120"/>
+              <w:bottom w:type="dxa" w:w="70"/>
               <w:right w:type="dxa" w:w="120"/>
             </w:tcMar>
           </w:tcPr>
@@ -734,12 +1030,14 @@
             <w:r>
               <w:rPr>
                 <w:rFonts w:ascii="Arial" w:cs="Arial" w:eastAsia="Arial" w:hAnsi="Arial"/>
-                <w:b w:val="false"/>
-                <w:bCs w:val="false"/>
-                <w:sz w:val="20"/>
-                <w:szCs w:val="20"/>
-              </w:rPr>
-              <w:t xml:space="preserve">$297.00</w:t>
+                <w:b/>
+                <w:bCs/>
+                <w:i w:val="false"/>
+                <w:iCs w:val="false"/>
+                <w:sz w:val="19"/>
+                <w:szCs w:val="19"/>
+              </w:rPr>
+              <w:t xml:space="preserve">$693.00</w:t>
             </w:r>
           </w:p>
         </w:tc>
@@ -747,53 +1045,31 @@
       <w:tr>
         <w:tc>
           <w:tcPr>
-            <w:tcW w:type="dxa" w:w="5400"/>
-            <w:tcMar>
-              <w:top w:type="dxa" w:w="80"/>
-              <w:left w:type="dxa" w:w="120"/>
-              <w:bottom w:type="dxa" w:w="80"/>
-              <w:right w:type="dxa" w:w="120"/>
-            </w:tcMar>
-          </w:tcPr>
-          <w:p>
-            <w:pPr>
-              <w:jc w:val="left"/>
-            </w:pPr>
-            <w:r>
-              <w:rPr>
-                <w:rFonts w:ascii="Arial" w:cs="Arial" w:eastAsia="Arial" w:hAnsi="Arial"/>
-                <w:b w:val="false"/>
-                <w:bCs w:val="false"/>
-                <w:sz w:val="20"/>
-                <w:szCs w:val="20"/>
-              </w:rPr>
-              <w:t xml:space="preserve">Sep-26</w:t>
-            </w:r>
-          </w:p>
-        </w:tc>
-        <w:tc>
-          <w:tcPr>
-            <w:tcW w:type="dxa" w:w="1800"/>
-            <w:tcMar>
-              <w:top w:type="dxa" w:w="80"/>
-              <w:left w:type="dxa" w:w="120"/>
-              <w:bottom w:type="dxa" w:w="80"/>
-              <w:right w:type="dxa" w:w="120"/>
-            </w:tcMar>
-          </w:tcPr>
-          <w:p>
-            <w:pPr>
-              <w:jc w:val="right"/>
-            </w:pPr>
-            <w:r>
-              <w:rPr>
-                <w:rFonts w:ascii="Arial" w:cs="Arial" w:eastAsia="Arial" w:hAnsi="Arial"/>
-                <w:b w:val="false"/>
-                <w:bCs w:val="false"/>
-                <w:sz w:val="20"/>
-                <w:szCs w:val="20"/>
-              </w:rPr>
-              <w:t xml:space="preserve">$0.00</w:t>
+            <w:tcW w:type="dxa" w:w="8200"/>
+            <w:gridSpan w:val="3"/>
+            <w:shd w:fill="E5E7EB" w:val="clear"/>
+            <w:tcMar>
+              <w:top w:type="dxa" w:w="70"/>
+              <w:left w:type="dxa" w:w="120"/>
+              <w:bottom w:type="dxa" w:w="70"/>
+              <w:right w:type="dxa" w:w="120"/>
+            </w:tcMar>
+          </w:tcPr>
+          <w:p>
+            <w:pPr>
+              <w:jc w:val="left"/>
+            </w:pPr>
+            <w:r>
+              <w:rPr>
+                <w:rFonts w:ascii="Arial" w:cs="Arial" w:eastAsia="Arial" w:hAnsi="Arial"/>
+                <w:b/>
+                <w:bCs/>
+                <w:i w:val="false"/>
+                <w:iCs w:val="false"/>
+                <w:sz w:val="19"/>
+                <w:szCs w:val="19"/>
+              </w:rPr>
+              <w:t xml:space="preserve">Gratitude and Growth Counseling LLC</w:t>
             </w:r>
           </w:p>
         </w:tc>
@@ -801,12 +1077,12 @@
       <w:tr>
         <w:tc>
           <w:tcPr>
-            <w:tcW w:type="dxa" w:w="5400"/>
-            <w:shd w:fill="F3F4F6" w:val="clear"/>
-            <w:tcMar>
-              <w:top w:type="dxa" w:w="80"/>
-              <w:left w:type="dxa" w:w="120"/>
-              <w:bottom w:type="dxa" w:w="80"/>
+            <w:tcW w:type="dxa" w:w="2600"/>
+            <w:shd w:fill="1F2937" w:val="clear"/>
+            <w:tcMar>
+              <w:top w:type="dxa" w:w="70"/>
+              <w:left w:type="dxa" w:w="120"/>
+              <w:bottom w:type="dxa" w:w="70"/>
               <w:right w:type="dxa" w:w="120"/>
             </w:tcMar>
           </w:tcPr>
@@ -819,35 +1095,1068 @@
                 <w:rFonts w:ascii="Arial" w:cs="Arial" w:eastAsia="Arial" w:hAnsi="Arial"/>
                 <w:b/>
                 <w:bCs/>
-                <w:sz w:val="20"/>
-                <w:szCs w:val="20"/>
-              </w:rPr>
-              <w:t xml:space="preserve">Total (15 invoices, 3 clients)</w:t>
-            </w:r>
-          </w:p>
-        </w:tc>
-        <w:tc>
-          <w:tcPr>
-            <w:tcW w:type="dxa" w:w="1800"/>
-            <w:shd w:fill="F3F4F6" w:val="clear"/>
-            <w:tcMar>
-              <w:top w:type="dxa" w:w="80"/>
-              <w:left w:type="dxa" w:w="120"/>
-              <w:bottom w:type="dxa" w:w="80"/>
-              <w:right w:type="dxa" w:w="120"/>
-            </w:tcMar>
-          </w:tcPr>
-          <w:p>
-            <w:pPr>
-              <w:jc w:val="right"/>
+                <w:i w:val="false"/>
+                <w:iCs w:val="false"/>
+                <w:color w:val="FFFFFF"/>
+                <w:sz w:val="19"/>
+                <w:szCs w:val="19"/>
+              </w:rPr>
+              <w:t xml:space="preserve">Date</w:t>
+            </w:r>
+          </w:p>
+        </w:tc>
+        <w:tc>
+          <w:tcPr>
+            <w:tcW w:type="dxa" w:w="2600"/>
+            <w:shd w:fill="1F2937" w:val="clear"/>
+            <w:tcMar>
+              <w:top w:type="dxa" w:w="70"/>
+              <w:left w:type="dxa" w:w="120"/>
+              <w:bottom w:type="dxa" w:w="70"/>
+              <w:right w:type="dxa" w:w="120"/>
+            </w:tcMar>
+          </w:tcPr>
+          <w:p>
+            <w:pPr>
+              <w:jc w:val="left"/>
             </w:pPr>
             <w:r>
               <w:rPr>
                 <w:rFonts w:ascii="Arial" w:cs="Arial" w:eastAsia="Arial" w:hAnsi="Arial"/>
                 <w:b/>
                 <w:bCs/>
-                <w:sz w:val="20"/>
-                <w:szCs w:val="20"/>
+                <w:i w:val="false"/>
+                <w:iCs w:val="false"/>
+                <w:color w:val="FFFFFF"/>
+                <w:sz w:val="19"/>
+                <w:szCs w:val="19"/>
+              </w:rPr>
+              <w:t xml:space="preserve">Invoice #</w:t>
+            </w:r>
+          </w:p>
+        </w:tc>
+        <w:tc>
+          <w:tcPr>
+            <w:tcW w:type="dxa" w:w="3000"/>
+            <w:shd w:fill="1F2937" w:val="clear"/>
+            <w:tcMar>
+              <w:top w:type="dxa" w:w="70"/>
+              <w:left w:type="dxa" w:w="120"/>
+              <w:bottom w:type="dxa" w:w="70"/>
+              <w:right w:type="dxa" w:w="120"/>
+            </w:tcMar>
+          </w:tcPr>
+          <w:p>
+            <w:pPr>
+              <w:jc w:val="right"/>
+            </w:pPr>
+            <w:r>
+              <w:rPr>
+                <w:rFonts w:ascii="Arial" w:cs="Arial" w:eastAsia="Arial" w:hAnsi="Arial"/>
+                <w:b/>
+                <w:bCs/>
+                <w:i w:val="false"/>
+                <w:iCs w:val="false"/>
+                <w:color w:val="FFFFFF"/>
+                <w:sz w:val="19"/>
+                <w:szCs w:val="19"/>
+              </w:rPr>
+              <w:t xml:space="preserve">Amount</w:t>
+            </w:r>
+          </w:p>
+        </w:tc>
+      </w:tr>
+      <w:tr>
+        <w:tc>
+          <w:tcPr>
+            <w:tcW w:type="dxa" w:w="2600"/>
+            <w:tcMar>
+              <w:top w:type="dxa" w:w="70"/>
+              <w:left w:type="dxa" w:w="120"/>
+              <w:bottom w:type="dxa" w:w="70"/>
+              <w:right w:type="dxa" w:w="120"/>
+            </w:tcMar>
+          </w:tcPr>
+          <w:p>
+            <w:pPr>
+              <w:jc w:val="left"/>
+            </w:pPr>
+            <w:r>
+              <w:rPr>
+                <w:rFonts w:ascii="Arial" w:cs="Arial" w:eastAsia="Arial" w:hAnsi="Arial"/>
+                <w:b w:val="false"/>
+                <w:bCs w:val="false"/>
+                <w:i w:val="false"/>
+                <w:iCs w:val="false"/>
+                <w:sz w:val="19"/>
+                <w:szCs w:val="19"/>
+              </w:rPr>
+              <w:t xml:space="preserve">1/31/26</w:t>
+            </w:r>
+          </w:p>
+        </w:tc>
+        <w:tc>
+          <w:tcPr>
+            <w:tcW w:type="dxa" w:w="2600"/>
+            <w:tcMar>
+              <w:top w:type="dxa" w:w="70"/>
+              <w:left w:type="dxa" w:w="120"/>
+              <w:bottom w:type="dxa" w:w="70"/>
+              <w:right w:type="dxa" w:w="120"/>
+            </w:tcMar>
+          </w:tcPr>
+          <w:p>
+            <w:pPr>
+              <w:jc w:val="left"/>
+            </w:pPr>
+            <w:r>
+              <w:rPr>
+                <w:rFonts w:ascii="Arial" w:cs="Arial" w:eastAsia="Arial" w:hAnsi="Arial"/>
+                <w:b w:val="false"/>
+                <w:bCs w:val="false"/>
+                <w:i w:val="false"/>
+                <w:iCs w:val="false"/>
+                <w:sz w:val="19"/>
+                <w:szCs w:val="19"/>
+              </w:rPr>
+              <w:t xml:space="preserve">22182</w:t>
+            </w:r>
+          </w:p>
+        </w:tc>
+        <w:tc>
+          <w:tcPr>
+            <w:tcW w:type="dxa" w:w="3000"/>
+            <w:tcMar>
+              <w:top w:type="dxa" w:w="70"/>
+              <w:left w:type="dxa" w:w="120"/>
+              <w:bottom w:type="dxa" w:w="70"/>
+              <w:right w:type="dxa" w:w="120"/>
+            </w:tcMar>
+          </w:tcPr>
+          <w:p>
+            <w:pPr>
+              <w:jc w:val="right"/>
+            </w:pPr>
+            <w:r>
+              <w:rPr>
+                <w:rFonts w:ascii="Arial" w:cs="Arial" w:eastAsia="Arial" w:hAnsi="Arial"/>
+                <w:b w:val="false"/>
+                <w:bCs w:val="false"/>
+                <w:i w:val="false"/>
+                <w:iCs w:val="false"/>
+                <w:sz w:val="19"/>
+                <w:szCs w:val="19"/>
+              </w:rPr>
+              <w:t xml:space="preserve">$99.00</w:t>
+            </w:r>
+          </w:p>
+        </w:tc>
+      </w:tr>
+      <w:tr>
+        <w:tc>
+          <w:tcPr>
+            <w:tcW w:type="dxa" w:w="2600"/>
+            <w:tcMar>
+              <w:top w:type="dxa" w:w="70"/>
+              <w:left w:type="dxa" w:w="120"/>
+              <w:bottom w:type="dxa" w:w="70"/>
+              <w:right w:type="dxa" w:w="120"/>
+            </w:tcMar>
+          </w:tcPr>
+          <w:p>
+            <w:pPr>
+              <w:jc w:val="left"/>
+            </w:pPr>
+            <w:r>
+              <w:rPr>
+                <w:rFonts w:ascii="Arial" w:cs="Arial" w:eastAsia="Arial" w:hAnsi="Arial"/>
+                <w:b w:val="false"/>
+                <w:bCs w:val="false"/>
+                <w:i w:val="false"/>
+                <w:iCs w:val="false"/>
+                <w:sz w:val="19"/>
+                <w:szCs w:val="19"/>
+              </w:rPr>
+              <w:t xml:space="preserve">3/2/26</w:t>
+            </w:r>
+          </w:p>
+        </w:tc>
+        <w:tc>
+          <w:tcPr>
+            <w:tcW w:type="dxa" w:w="2600"/>
+            <w:tcMar>
+              <w:top w:type="dxa" w:w="70"/>
+              <w:left w:type="dxa" w:w="120"/>
+              <w:bottom w:type="dxa" w:w="70"/>
+              <w:right w:type="dxa" w:w="120"/>
+            </w:tcMar>
+          </w:tcPr>
+          <w:p>
+            <w:pPr>
+              <w:jc w:val="left"/>
+            </w:pPr>
+            <w:r>
+              <w:rPr>
+                <w:rFonts w:ascii="Arial" w:cs="Arial" w:eastAsia="Arial" w:hAnsi="Arial"/>
+                <w:b w:val="false"/>
+                <w:bCs w:val="false"/>
+                <w:i w:val="false"/>
+                <w:iCs w:val="false"/>
+                <w:sz w:val="19"/>
+                <w:szCs w:val="19"/>
+              </w:rPr>
+              <w:t xml:space="preserve">22189</w:t>
+            </w:r>
+          </w:p>
+        </w:tc>
+        <w:tc>
+          <w:tcPr>
+            <w:tcW w:type="dxa" w:w="3000"/>
+            <w:tcMar>
+              <w:top w:type="dxa" w:w="70"/>
+              <w:left w:type="dxa" w:w="120"/>
+              <w:bottom w:type="dxa" w:w="70"/>
+              <w:right w:type="dxa" w:w="120"/>
+            </w:tcMar>
+          </w:tcPr>
+          <w:p>
+            <w:pPr>
+              <w:jc w:val="right"/>
+            </w:pPr>
+            <w:r>
+              <w:rPr>
+                <w:rFonts w:ascii="Arial" w:cs="Arial" w:eastAsia="Arial" w:hAnsi="Arial"/>
+                <w:b w:val="false"/>
+                <w:bCs w:val="false"/>
+                <w:i w:val="false"/>
+                <w:iCs w:val="false"/>
+                <w:sz w:val="19"/>
+                <w:szCs w:val="19"/>
+              </w:rPr>
+              <w:t xml:space="preserve">$99.00</w:t>
+            </w:r>
+          </w:p>
+        </w:tc>
+      </w:tr>
+      <w:tr>
+        <w:tc>
+          <w:tcPr>
+            <w:tcW w:type="dxa" w:w="2600"/>
+            <w:tcMar>
+              <w:top w:type="dxa" w:w="70"/>
+              <w:left w:type="dxa" w:w="120"/>
+              <w:bottom w:type="dxa" w:w="70"/>
+              <w:right w:type="dxa" w:w="120"/>
+            </w:tcMar>
+          </w:tcPr>
+          <w:p>
+            <w:pPr>
+              <w:jc w:val="left"/>
+            </w:pPr>
+            <w:r>
+              <w:rPr>
+                <w:rFonts w:ascii="Arial" w:cs="Arial" w:eastAsia="Arial" w:hAnsi="Arial"/>
+                <w:b w:val="false"/>
+                <w:bCs w:val="false"/>
+                <w:i w:val="false"/>
+                <w:iCs w:val="false"/>
+                <w:sz w:val="19"/>
+                <w:szCs w:val="19"/>
+              </w:rPr>
+              <w:t xml:space="preserve">3/31/26</w:t>
+            </w:r>
+          </w:p>
+        </w:tc>
+        <w:tc>
+          <w:tcPr>
+            <w:tcW w:type="dxa" w:w="2600"/>
+            <w:tcMar>
+              <w:top w:type="dxa" w:w="70"/>
+              <w:left w:type="dxa" w:w="120"/>
+              <w:bottom w:type="dxa" w:w="70"/>
+              <w:right w:type="dxa" w:w="120"/>
+            </w:tcMar>
+          </w:tcPr>
+          <w:p>
+            <w:pPr>
+              <w:jc w:val="left"/>
+            </w:pPr>
+            <w:r>
+              <w:rPr>
+                <w:rFonts w:ascii="Arial" w:cs="Arial" w:eastAsia="Arial" w:hAnsi="Arial"/>
+                <w:b w:val="false"/>
+                <w:bCs w:val="false"/>
+                <w:i w:val="false"/>
+                <w:iCs w:val="false"/>
+                <w:sz w:val="19"/>
+                <w:szCs w:val="19"/>
+              </w:rPr>
+              <w:t xml:space="preserve">22193</w:t>
+            </w:r>
+          </w:p>
+        </w:tc>
+        <w:tc>
+          <w:tcPr>
+            <w:tcW w:type="dxa" w:w="3000"/>
+            <w:tcMar>
+              <w:top w:type="dxa" w:w="70"/>
+              <w:left w:type="dxa" w:w="120"/>
+              <w:bottom w:type="dxa" w:w="70"/>
+              <w:right w:type="dxa" w:w="120"/>
+            </w:tcMar>
+          </w:tcPr>
+          <w:p>
+            <w:pPr>
+              <w:jc w:val="right"/>
+            </w:pPr>
+            <w:r>
+              <w:rPr>
+                <w:rFonts w:ascii="Arial" w:cs="Arial" w:eastAsia="Arial" w:hAnsi="Arial"/>
+                <w:b w:val="false"/>
+                <w:bCs w:val="false"/>
+                <w:i w:val="false"/>
+                <w:iCs w:val="false"/>
+                <w:sz w:val="19"/>
+                <w:szCs w:val="19"/>
+              </w:rPr>
+              <w:t xml:space="preserve">$99.00</w:t>
+            </w:r>
+          </w:p>
+        </w:tc>
+      </w:tr>
+      <w:tr>
+        <w:tc>
+          <w:tcPr>
+            <w:tcW w:type="dxa" w:w="2600"/>
+            <w:tcMar>
+              <w:top w:type="dxa" w:w="70"/>
+              <w:left w:type="dxa" w:w="120"/>
+              <w:bottom w:type="dxa" w:w="70"/>
+              <w:right w:type="dxa" w:w="120"/>
+            </w:tcMar>
+          </w:tcPr>
+          <w:p>
+            <w:pPr>
+              <w:jc w:val="left"/>
+            </w:pPr>
+            <w:r>
+              <w:rPr>
+                <w:rFonts w:ascii="Arial" w:cs="Arial" w:eastAsia="Arial" w:hAnsi="Arial"/>
+                <w:b w:val="false"/>
+                <w:bCs w:val="false"/>
+                <w:i w:val="false"/>
+                <w:iCs w:val="false"/>
+                <w:sz w:val="19"/>
+                <w:szCs w:val="19"/>
+              </w:rPr>
+              <w:t xml:space="preserve">5/4/26</w:t>
+            </w:r>
+          </w:p>
+        </w:tc>
+        <w:tc>
+          <w:tcPr>
+            <w:tcW w:type="dxa" w:w="2600"/>
+            <w:tcMar>
+              <w:top w:type="dxa" w:w="70"/>
+              <w:left w:type="dxa" w:w="120"/>
+              <w:bottom w:type="dxa" w:w="70"/>
+              <w:right w:type="dxa" w:w="120"/>
+            </w:tcMar>
+          </w:tcPr>
+          <w:p>
+            <w:pPr>
+              <w:jc w:val="left"/>
+            </w:pPr>
+            <w:r>
+              <w:rPr>
+                <w:rFonts w:ascii="Arial" w:cs="Arial" w:eastAsia="Arial" w:hAnsi="Arial"/>
+                <w:b w:val="false"/>
+                <w:bCs w:val="false"/>
+                <w:i w:val="false"/>
+                <w:iCs w:val="false"/>
+                <w:sz w:val="19"/>
+                <w:szCs w:val="19"/>
+              </w:rPr>
+              <w:t xml:space="preserve">22196</w:t>
+            </w:r>
+          </w:p>
+        </w:tc>
+        <w:tc>
+          <w:tcPr>
+            <w:tcW w:type="dxa" w:w="3000"/>
+            <w:tcMar>
+              <w:top w:type="dxa" w:w="70"/>
+              <w:left w:type="dxa" w:w="120"/>
+              <w:bottom w:type="dxa" w:w="70"/>
+              <w:right w:type="dxa" w:w="120"/>
+            </w:tcMar>
+          </w:tcPr>
+          <w:p>
+            <w:pPr>
+              <w:jc w:val="right"/>
+            </w:pPr>
+            <w:r>
+              <w:rPr>
+                <w:rFonts w:ascii="Arial" w:cs="Arial" w:eastAsia="Arial" w:hAnsi="Arial"/>
+                <w:b w:val="false"/>
+                <w:bCs w:val="false"/>
+                <w:i w:val="false"/>
+                <w:iCs w:val="false"/>
+                <w:sz w:val="19"/>
+                <w:szCs w:val="19"/>
+              </w:rPr>
+              <w:t xml:space="preserve">$99.00</w:t>
+            </w:r>
+          </w:p>
+        </w:tc>
+      </w:tr>
+      <w:tr>
+        <w:tc>
+          <w:tcPr>
+            <w:tcW w:type="dxa" w:w="2600"/>
+            <w:tcMar>
+              <w:top w:type="dxa" w:w="70"/>
+              <w:left w:type="dxa" w:w="120"/>
+              <w:bottom w:type="dxa" w:w="70"/>
+              <w:right w:type="dxa" w:w="120"/>
+            </w:tcMar>
+          </w:tcPr>
+          <w:p>
+            <w:pPr>
+              <w:jc w:val="left"/>
+            </w:pPr>
+            <w:r>
+              <w:rPr>
+                <w:rFonts w:ascii="Arial" w:cs="Arial" w:eastAsia="Arial" w:hAnsi="Arial"/>
+                <w:b w:val="false"/>
+                <w:bCs w:val="false"/>
+                <w:i w:val="false"/>
+                <w:iCs w:val="false"/>
+                <w:sz w:val="19"/>
+                <w:szCs w:val="19"/>
+              </w:rPr>
+              <w:t xml:space="preserve">6/8/26</w:t>
+            </w:r>
+          </w:p>
+        </w:tc>
+        <w:tc>
+          <w:tcPr>
+            <w:tcW w:type="dxa" w:w="2600"/>
+            <w:tcMar>
+              <w:top w:type="dxa" w:w="70"/>
+              <w:left w:type="dxa" w:w="120"/>
+              <w:bottom w:type="dxa" w:w="70"/>
+              <w:right w:type="dxa" w:w="120"/>
+            </w:tcMar>
+          </w:tcPr>
+          <w:p>
+            <w:pPr>
+              <w:jc w:val="left"/>
+            </w:pPr>
+            <w:r>
+              <w:rPr>
+                <w:rFonts w:ascii="Arial" w:cs="Arial" w:eastAsia="Arial" w:hAnsi="Arial"/>
+                <w:b w:val="false"/>
+                <w:bCs w:val="false"/>
+                <w:i w:val="false"/>
+                <w:iCs w:val="false"/>
+                <w:sz w:val="19"/>
+                <w:szCs w:val="19"/>
+              </w:rPr>
+              <w:t xml:space="preserve">22202</w:t>
+            </w:r>
+          </w:p>
+        </w:tc>
+        <w:tc>
+          <w:tcPr>
+            <w:tcW w:type="dxa" w:w="3000"/>
+            <w:tcMar>
+              <w:top w:type="dxa" w:w="70"/>
+              <w:left w:type="dxa" w:w="120"/>
+              <w:bottom w:type="dxa" w:w="70"/>
+              <w:right w:type="dxa" w:w="120"/>
+            </w:tcMar>
+          </w:tcPr>
+          <w:p>
+            <w:pPr>
+              <w:jc w:val="right"/>
+            </w:pPr>
+            <w:r>
+              <w:rPr>
+                <w:rFonts w:ascii="Arial" w:cs="Arial" w:eastAsia="Arial" w:hAnsi="Arial"/>
+                <w:b w:val="false"/>
+                <w:bCs w:val="false"/>
+                <w:i w:val="false"/>
+                <w:iCs w:val="false"/>
+                <w:sz w:val="19"/>
+                <w:szCs w:val="19"/>
+              </w:rPr>
+              <w:t xml:space="preserve">$99.00</w:t>
+            </w:r>
+          </w:p>
+        </w:tc>
+      </w:tr>
+      <w:tr>
+        <w:tc>
+          <w:tcPr>
+            <w:tcW w:type="dxa" w:w="2600"/>
+            <w:tcMar>
+              <w:top w:type="dxa" w:w="70"/>
+              <w:left w:type="dxa" w:w="120"/>
+              <w:bottom w:type="dxa" w:w="70"/>
+              <w:right w:type="dxa" w:w="120"/>
+            </w:tcMar>
+          </w:tcPr>
+          <w:p>
+            <w:pPr>
+              <w:jc w:val="left"/>
+            </w:pPr>
+            <w:r>
+              <w:rPr>
+                <w:rFonts w:ascii="Arial" w:cs="Arial" w:eastAsia="Arial" w:hAnsi="Arial"/>
+                <w:b w:val="false"/>
+                <w:bCs w:val="false"/>
+                <w:i w:val="false"/>
+                <w:iCs w:val="false"/>
+                <w:sz w:val="19"/>
+                <w:szCs w:val="19"/>
+              </w:rPr>
+              <w:t xml:space="preserve">7/1/26</w:t>
+            </w:r>
+          </w:p>
+        </w:tc>
+        <w:tc>
+          <w:tcPr>
+            <w:tcW w:type="dxa" w:w="2600"/>
+            <w:tcMar>
+              <w:top w:type="dxa" w:w="70"/>
+              <w:left w:type="dxa" w:w="120"/>
+              <w:bottom w:type="dxa" w:w="70"/>
+              <w:right w:type="dxa" w:w="120"/>
+            </w:tcMar>
+          </w:tcPr>
+          <w:p>
+            <w:pPr>
+              <w:jc w:val="left"/>
+            </w:pPr>
+            <w:r>
+              <w:rPr>
+                <w:rFonts w:ascii="Arial" w:cs="Arial" w:eastAsia="Arial" w:hAnsi="Arial"/>
+                <w:b w:val="false"/>
+                <w:bCs w:val="false"/>
+                <w:i w:val="false"/>
+                <w:iCs w:val="false"/>
+                <w:sz w:val="19"/>
+                <w:szCs w:val="19"/>
+              </w:rPr>
+              <w:t xml:space="preserve">22205</w:t>
+            </w:r>
+          </w:p>
+        </w:tc>
+        <w:tc>
+          <w:tcPr>
+            <w:tcW w:type="dxa" w:w="3000"/>
+            <w:tcMar>
+              <w:top w:type="dxa" w:w="70"/>
+              <w:left w:type="dxa" w:w="120"/>
+              <w:bottom w:type="dxa" w:w="70"/>
+              <w:right w:type="dxa" w:w="120"/>
+            </w:tcMar>
+          </w:tcPr>
+          <w:p>
+            <w:pPr>
+              <w:jc w:val="right"/>
+            </w:pPr>
+            <w:r>
+              <w:rPr>
+                <w:rFonts w:ascii="Arial" w:cs="Arial" w:eastAsia="Arial" w:hAnsi="Arial"/>
+                <w:b w:val="false"/>
+                <w:bCs w:val="false"/>
+                <w:i w:val="false"/>
+                <w:iCs w:val="false"/>
+                <w:sz w:val="19"/>
+                <w:szCs w:val="19"/>
+              </w:rPr>
+              <w:t xml:space="preserve">$99.00</w:t>
+            </w:r>
+          </w:p>
+        </w:tc>
+      </w:tr>
+      <w:tr>
+        <w:tc>
+          <w:tcPr>
+            <w:tcW w:type="dxa" w:w="2600"/>
+            <w:tcMar>
+              <w:top w:type="dxa" w:w="70"/>
+              <w:left w:type="dxa" w:w="120"/>
+              <w:bottom w:type="dxa" w:w="70"/>
+              <w:right w:type="dxa" w:w="120"/>
+            </w:tcMar>
+          </w:tcPr>
+          <w:p>
+            <w:pPr>
+              <w:jc w:val="left"/>
+            </w:pPr>
+            <w:r>
+              <w:rPr>
+                <w:rFonts w:ascii="Arial" w:cs="Arial" w:eastAsia="Arial" w:hAnsi="Arial"/>
+                <w:b w:val="false"/>
+                <w:bCs w:val="false"/>
+                <w:i w:val="false"/>
+                <w:iCs w:val="false"/>
+                <w:sz w:val="19"/>
+                <w:szCs w:val="19"/>
+              </w:rPr>
+              <w:t xml:space="preserve">8/5/26</w:t>
+            </w:r>
+          </w:p>
+        </w:tc>
+        <w:tc>
+          <w:tcPr>
+            <w:tcW w:type="dxa" w:w="2600"/>
+            <w:tcMar>
+              <w:top w:type="dxa" w:w="70"/>
+              <w:left w:type="dxa" w:w="120"/>
+              <w:bottom w:type="dxa" w:w="70"/>
+              <w:right w:type="dxa" w:w="120"/>
+            </w:tcMar>
+          </w:tcPr>
+          <w:p>
+            <w:pPr>
+              <w:jc w:val="left"/>
+            </w:pPr>
+            <w:r>
+              <w:rPr>
+                <w:rFonts w:ascii="Arial" w:cs="Arial" w:eastAsia="Arial" w:hAnsi="Arial"/>
+                <w:b w:val="false"/>
+                <w:bCs w:val="false"/>
+                <w:i w:val="false"/>
+                <w:iCs w:val="false"/>
+                <w:sz w:val="19"/>
+                <w:szCs w:val="19"/>
+              </w:rPr>
+              <w:t xml:space="preserve">22210</w:t>
+            </w:r>
+          </w:p>
+        </w:tc>
+        <w:tc>
+          <w:tcPr>
+            <w:tcW w:type="dxa" w:w="3000"/>
+            <w:tcMar>
+              <w:top w:type="dxa" w:w="70"/>
+              <w:left w:type="dxa" w:w="120"/>
+              <w:bottom w:type="dxa" w:w="70"/>
+              <w:right w:type="dxa" w:w="120"/>
+            </w:tcMar>
+          </w:tcPr>
+          <w:p>
+            <w:pPr>
+              <w:jc w:val="right"/>
+            </w:pPr>
+            <w:r>
+              <w:rPr>
+                <w:rFonts w:ascii="Arial" w:cs="Arial" w:eastAsia="Arial" w:hAnsi="Arial"/>
+                <w:b w:val="false"/>
+                <w:bCs w:val="false"/>
+                <w:i w:val="false"/>
+                <w:iCs w:val="false"/>
+                <w:sz w:val="19"/>
+                <w:szCs w:val="19"/>
+              </w:rPr>
+              <w:t xml:space="preserve">$99.00</w:t>
+            </w:r>
+          </w:p>
+        </w:tc>
+      </w:tr>
+      <w:tr>
+        <w:tc>
+          <w:tcPr>
+            <w:tcW w:type="dxa" w:w="5200"/>
+            <w:gridSpan w:val="2"/>
+            <w:shd w:fill="F3F4F6" w:val="clear"/>
+            <w:tcMar>
+              <w:top w:type="dxa" w:w="70"/>
+              <w:left w:type="dxa" w:w="120"/>
+              <w:bottom w:type="dxa" w:w="70"/>
+              <w:right w:type="dxa" w:w="120"/>
+            </w:tcMar>
+          </w:tcPr>
+          <w:p>
+            <w:pPr>
+              <w:jc w:val="left"/>
+            </w:pPr>
+            <w:r>
+              <w:rPr>
+                <w:rFonts w:ascii="Arial" w:cs="Arial" w:eastAsia="Arial" w:hAnsi="Arial"/>
+                <w:b/>
+                <w:bCs/>
+                <w:i w:val="false"/>
+                <w:iCs w:val="false"/>
+                <w:sz w:val="19"/>
+                <w:szCs w:val="19"/>
+              </w:rPr>
+              <w:t xml:space="preserve">Subtotal — 7 invoices</w:t>
+            </w:r>
+          </w:p>
+        </w:tc>
+        <w:tc>
+          <w:tcPr>
+            <w:tcW w:type="dxa" w:w="3000"/>
+            <w:shd w:fill="F3F4F6" w:val="clear"/>
+            <w:tcMar>
+              <w:top w:type="dxa" w:w="70"/>
+              <w:left w:type="dxa" w:w="120"/>
+              <w:bottom w:type="dxa" w:w="70"/>
+              <w:right w:type="dxa" w:w="120"/>
+            </w:tcMar>
+          </w:tcPr>
+          <w:p>
+            <w:pPr>
+              <w:jc w:val="right"/>
+            </w:pPr>
+            <w:r>
+              <w:rPr>
+                <w:rFonts w:ascii="Arial" w:cs="Arial" w:eastAsia="Arial" w:hAnsi="Arial"/>
+                <w:b/>
+                <w:bCs/>
+                <w:i w:val="false"/>
+                <w:iCs w:val="false"/>
+                <w:sz w:val="19"/>
+                <w:szCs w:val="19"/>
+              </w:rPr>
+              <w:t xml:space="preserve">$693.00</w:t>
+            </w:r>
+          </w:p>
+        </w:tc>
+      </w:tr>
+      <w:tr>
+        <w:tc>
+          <w:tcPr>
+            <w:tcW w:type="dxa" w:w="8200"/>
+            <w:gridSpan w:val="3"/>
+            <w:shd w:fill="E5E7EB" w:val="clear"/>
+            <w:tcMar>
+              <w:top w:type="dxa" w:w="70"/>
+              <w:left w:type="dxa" w:w="120"/>
+              <w:bottom w:type="dxa" w:w="70"/>
+              <w:right w:type="dxa" w:w="120"/>
+            </w:tcMar>
+          </w:tcPr>
+          <w:p>
+            <w:pPr>
+              <w:jc w:val="left"/>
+            </w:pPr>
+            <w:r>
+              <w:rPr>
+                <w:rFonts w:ascii="Arial" w:cs="Arial" w:eastAsia="Arial" w:hAnsi="Arial"/>
+                <w:b/>
+                <w:bCs/>
+                <w:i w:val="false"/>
+                <w:iCs w:val="false"/>
+                <w:sz w:val="19"/>
+                <w:szCs w:val="19"/>
+              </w:rPr>
+              <w:t xml:space="preserve">Guidance Through Grief Counseling Center, PLLC</w:t>
+            </w:r>
+          </w:p>
+        </w:tc>
+      </w:tr>
+      <w:tr>
+        <w:tc>
+          <w:tcPr>
+            <w:tcW w:type="dxa" w:w="2600"/>
+            <w:shd w:fill="1F2937" w:val="clear"/>
+            <w:tcMar>
+              <w:top w:type="dxa" w:w="70"/>
+              <w:left w:type="dxa" w:w="120"/>
+              <w:bottom w:type="dxa" w:w="70"/>
+              <w:right w:type="dxa" w:w="120"/>
+            </w:tcMar>
+          </w:tcPr>
+          <w:p>
+            <w:pPr>
+              <w:jc w:val="left"/>
+            </w:pPr>
+            <w:r>
+              <w:rPr>
+                <w:rFonts w:ascii="Arial" w:cs="Arial" w:eastAsia="Arial" w:hAnsi="Arial"/>
+                <w:b/>
+                <w:bCs/>
+                <w:i w:val="false"/>
+                <w:iCs w:val="false"/>
+                <w:color w:val="FFFFFF"/>
+                <w:sz w:val="19"/>
+                <w:szCs w:val="19"/>
+              </w:rPr>
+              <w:t xml:space="preserve">Date</w:t>
+            </w:r>
+          </w:p>
+        </w:tc>
+        <w:tc>
+          <w:tcPr>
+            <w:tcW w:type="dxa" w:w="2600"/>
+            <w:shd w:fill="1F2937" w:val="clear"/>
+            <w:tcMar>
+              <w:top w:type="dxa" w:w="70"/>
+              <w:left w:type="dxa" w:w="120"/>
+              <w:bottom w:type="dxa" w:w="70"/>
+              <w:right w:type="dxa" w:w="120"/>
+            </w:tcMar>
+          </w:tcPr>
+          <w:p>
+            <w:pPr>
+              <w:jc w:val="left"/>
+            </w:pPr>
+            <w:r>
+              <w:rPr>
+                <w:rFonts w:ascii="Arial" w:cs="Arial" w:eastAsia="Arial" w:hAnsi="Arial"/>
+                <w:b/>
+                <w:bCs/>
+                <w:i w:val="false"/>
+                <w:iCs w:val="false"/>
+                <w:color w:val="FFFFFF"/>
+                <w:sz w:val="19"/>
+                <w:szCs w:val="19"/>
+              </w:rPr>
+              <w:t xml:space="preserve">Invoice #</w:t>
+            </w:r>
+          </w:p>
+        </w:tc>
+        <w:tc>
+          <w:tcPr>
+            <w:tcW w:type="dxa" w:w="3000"/>
+            <w:shd w:fill="1F2937" w:val="clear"/>
+            <w:tcMar>
+              <w:top w:type="dxa" w:w="70"/>
+              <w:left w:type="dxa" w:w="120"/>
+              <w:bottom w:type="dxa" w:w="70"/>
+              <w:right w:type="dxa" w:w="120"/>
+            </w:tcMar>
+          </w:tcPr>
+          <w:p>
+            <w:pPr>
+              <w:jc w:val="right"/>
+            </w:pPr>
+            <w:r>
+              <w:rPr>
+                <w:rFonts w:ascii="Arial" w:cs="Arial" w:eastAsia="Arial" w:hAnsi="Arial"/>
+                <w:b/>
+                <w:bCs/>
+                <w:i w:val="false"/>
+                <w:iCs w:val="false"/>
+                <w:color w:val="FFFFFF"/>
+                <w:sz w:val="19"/>
+                <w:szCs w:val="19"/>
+              </w:rPr>
+              <w:t xml:space="preserve">Amount</w:t>
+            </w:r>
+          </w:p>
+        </w:tc>
+      </w:tr>
+      <w:tr>
+        <w:tc>
+          <w:tcPr>
+            <w:tcW w:type="dxa" w:w="2600"/>
+            <w:tcMar>
+              <w:top w:type="dxa" w:w="70"/>
+              <w:left w:type="dxa" w:w="120"/>
+              <w:bottom w:type="dxa" w:w="70"/>
+              <w:right w:type="dxa" w:w="120"/>
+            </w:tcMar>
+          </w:tcPr>
+          <w:p>
+            <w:pPr>
+              <w:jc w:val="left"/>
+            </w:pPr>
+            <w:r>
+              <w:rPr>
+                <w:rFonts w:ascii="Arial" w:cs="Arial" w:eastAsia="Arial" w:hAnsi="Arial"/>
+                <w:b w:val="false"/>
+                <w:bCs w:val="false"/>
+                <w:i w:val="false"/>
+                <w:iCs w:val="false"/>
+                <w:sz w:val="19"/>
+                <w:szCs w:val="19"/>
+              </w:rPr>
+              <w:t xml:space="preserve">8/5/26</w:t>
+            </w:r>
+          </w:p>
+        </w:tc>
+        <w:tc>
+          <w:tcPr>
+            <w:tcW w:type="dxa" w:w="2600"/>
+            <w:tcMar>
+              <w:top w:type="dxa" w:w="70"/>
+              <w:left w:type="dxa" w:w="120"/>
+              <w:bottom w:type="dxa" w:w="70"/>
+              <w:right w:type="dxa" w:w="120"/>
+            </w:tcMar>
+          </w:tcPr>
+          <w:p>
+            <w:pPr>
+              <w:jc w:val="left"/>
+            </w:pPr>
+            <w:r>
+              <w:rPr>
+                <w:rFonts w:ascii="Arial" w:cs="Arial" w:eastAsia="Arial" w:hAnsi="Arial"/>
+                <w:b w:val="false"/>
+                <w:bCs w:val="false"/>
+                <w:i w:val="false"/>
+                <w:iCs w:val="false"/>
+                <w:sz w:val="19"/>
+                <w:szCs w:val="19"/>
+              </w:rPr>
+              <w:t xml:space="preserve">22211</w:t>
+            </w:r>
+          </w:p>
+        </w:tc>
+        <w:tc>
+          <w:tcPr>
+            <w:tcW w:type="dxa" w:w="3000"/>
+            <w:tcMar>
+              <w:top w:type="dxa" w:w="70"/>
+              <w:left w:type="dxa" w:w="120"/>
+              <w:bottom w:type="dxa" w:w="70"/>
+              <w:right w:type="dxa" w:w="120"/>
+            </w:tcMar>
+          </w:tcPr>
+          <w:p>
+            <w:pPr>
+              <w:jc w:val="right"/>
+            </w:pPr>
+            <w:r>
+              <w:rPr>
+                <w:rFonts w:ascii="Arial" w:cs="Arial" w:eastAsia="Arial" w:hAnsi="Arial"/>
+                <w:b w:val="false"/>
+                <w:bCs w:val="false"/>
+                <w:i w:val="false"/>
+                <w:iCs w:val="false"/>
+                <w:sz w:val="19"/>
+                <w:szCs w:val="19"/>
+              </w:rPr>
+              <w:t xml:space="preserve">$99.00</w:t>
+            </w:r>
+          </w:p>
+        </w:tc>
+      </w:tr>
+      <w:tr>
+        <w:tc>
+          <w:tcPr>
+            <w:tcW w:type="dxa" w:w="5200"/>
+            <w:gridSpan w:val="2"/>
+            <w:shd w:fill="F3F4F6" w:val="clear"/>
+            <w:tcMar>
+              <w:top w:type="dxa" w:w="70"/>
+              <w:left w:type="dxa" w:w="120"/>
+              <w:bottom w:type="dxa" w:w="70"/>
+              <w:right w:type="dxa" w:w="120"/>
+            </w:tcMar>
+          </w:tcPr>
+          <w:p>
+            <w:pPr>
+              <w:jc w:val="left"/>
+            </w:pPr>
+            <w:r>
+              <w:rPr>
+                <w:rFonts w:ascii="Arial" w:cs="Arial" w:eastAsia="Arial" w:hAnsi="Arial"/>
+                <w:b/>
+                <w:bCs/>
+                <w:i w:val="false"/>
+                <w:iCs w:val="false"/>
+                <w:sz w:val="19"/>
+                <w:szCs w:val="19"/>
+              </w:rPr>
+              <w:t xml:space="preserve">Subtotal — 1 invoice</w:t>
+            </w:r>
+          </w:p>
+        </w:tc>
+        <w:tc>
+          <w:tcPr>
+            <w:tcW w:type="dxa" w:w="3000"/>
+            <w:shd w:fill="F3F4F6" w:val="clear"/>
+            <w:tcMar>
+              <w:top w:type="dxa" w:w="70"/>
+              <w:left w:type="dxa" w:w="120"/>
+              <w:bottom w:type="dxa" w:w="70"/>
+              <w:right w:type="dxa" w:w="120"/>
+            </w:tcMar>
+          </w:tcPr>
+          <w:p>
+            <w:pPr>
+              <w:jc w:val="right"/>
+            </w:pPr>
+            <w:r>
+              <w:rPr>
+                <w:rFonts w:ascii="Arial" w:cs="Arial" w:eastAsia="Arial" w:hAnsi="Arial"/>
+                <w:b/>
+                <w:bCs/>
+                <w:i w:val="false"/>
+                <w:iCs w:val="false"/>
+                <w:sz w:val="19"/>
+                <w:szCs w:val="19"/>
+              </w:rPr>
+              <w:t xml:space="preserve">$99.00</w:t>
+            </w:r>
+          </w:p>
+        </w:tc>
+      </w:tr>
+      <w:tr>
+        <w:tc>
+          <w:tcPr>
+            <w:tcW w:type="dxa" w:w="5200"/>
+            <w:gridSpan w:val="2"/>
+            <w:shd w:fill="1F2937" w:val="clear"/>
+            <w:tcMar>
+              <w:top w:type="dxa" w:w="70"/>
+              <w:left w:type="dxa" w:w="120"/>
+              <w:bottom w:type="dxa" w:w="70"/>
+              <w:right w:type="dxa" w:w="120"/>
+            </w:tcMar>
+          </w:tcPr>
+          <w:p>
+            <w:pPr>
+              <w:jc w:val="left"/>
+            </w:pPr>
+            <w:r>
+              <w:rPr>
+                <w:rFonts w:ascii="Arial" w:cs="Arial" w:eastAsia="Arial" w:hAnsi="Arial"/>
+                <w:b/>
+                <w:bCs/>
+                <w:i w:val="false"/>
+                <w:iCs w:val="false"/>
+                <w:color w:val="FFFFFF"/>
+                <w:sz w:val="19"/>
+                <w:szCs w:val="19"/>
+              </w:rPr>
+              <w:t xml:space="preserve">TOTAL — 15 invoices, 3 clients</w:t>
+            </w:r>
+          </w:p>
+        </w:tc>
+        <w:tc>
+          <w:tcPr>
+            <w:tcW w:type="dxa" w:w="3000"/>
+            <w:shd w:fill="1F2937" w:val="clear"/>
+            <w:tcMar>
+              <w:top w:type="dxa" w:w="70"/>
+              <w:left w:type="dxa" w:w="120"/>
+              <w:bottom w:type="dxa" w:w="70"/>
+              <w:right w:type="dxa" w:w="120"/>
+            </w:tcMar>
+          </w:tcPr>
+          <w:p>
+            <w:pPr>
+              <w:jc w:val="right"/>
+            </w:pPr>
+            <w:r>
+              <w:rPr>
+                <w:rFonts w:ascii="Arial" w:cs="Arial" w:eastAsia="Arial" w:hAnsi="Arial"/>
+                <w:b/>
+                <w:bCs/>
+                <w:i w:val="false"/>
+                <w:iCs w:val="false"/>
+                <w:color w:val="FFFFFF"/>
+                <w:sz w:val="19"/>
+                <w:szCs w:val="19"/>
               </w:rPr>
               <w:t xml:space="preserve">$1,485.00</w:t>
             </w:r>
@@ -868,7 +2177,7 @@
           <w:sz w:val="18"/>
           <w:szCs w:val="18"/>
         </w:rPr>
-        <w:t xml:space="preserve">Full invoice-level detail (date, invoice number, customer) is provided in Exhibit A (Patriot-Revenue-Import.csv / .xlsx).</w:t>
+        <w:t xml:space="preserve">Each invoice reflects the $99/month SEO &amp; Web Services membership fee for that client. Full transaction detail (including payment and deposit records) is provided in Exhibit A (Patriot-Revenue-Import.csv / .xlsx).</w:t>
       </w:r>
     </w:p>
     <w:p>

</xml_diff>